<commit_message>
actualizar bitacora de depuracion
</commit_message>
<xml_diff>
--- a/docs/informe.docx
+++ b/docs/informe.docx
@@ -11,6 +11,7 @@
           <w:b w:val="1"/>
           <w:bCs w:val="1"/>
           <w:noProof w:val="0"/>
+          <w:color w:val="auto"/>
           <w:sz w:val="22"/>
           <w:szCs w:val="22"/>
           <w:lang w:val="es-ES"/>
@@ -22,6 +23,7 @@
           <w:b w:val="1"/>
           <w:bCs w:val="1"/>
           <w:noProof w:val="0"/>
+          <w:color w:val="auto"/>
           <w:sz w:val="22"/>
           <w:szCs w:val="22"/>
           <w:lang w:val="es-ES"/>
@@ -35,15 +37,17 @@
         <w:rPr>
           <w:rFonts w:ascii="Arial" w:hAnsi="Arial" w:eastAsia="Arial" w:cs="Arial"/>
           <w:noProof w:val="0"/>
-          <w:sz w:val="22"/>
-          <w:szCs w:val="22"/>
-          <w:lang w:val="es-ES"/>
-        </w:rPr>
-      </w:pPr>
-      <w:r>
-        <w:rPr>
-          <w:rFonts w:ascii="Arial" w:hAnsi="Arial" w:eastAsia="Arial" w:cs="Arial"/>
-          <w:noProof w:val="0"/>
+          <w:color w:val="auto"/>
+          <w:sz w:val="22"/>
+          <w:szCs w:val="22"/>
+          <w:lang w:val="es-ES"/>
+        </w:rPr>
+      </w:pPr>
+      <w:r>
+        <w:rPr>
+          <w:rFonts w:ascii="Arial" w:hAnsi="Arial" w:eastAsia="Arial" w:cs="Arial"/>
+          <w:noProof w:val="0"/>
+          <w:color w:val="auto"/>
           <w:sz w:val="22"/>
           <w:szCs w:val="22"/>
           <w:lang w:val="es-ES"/>
@@ -54,6 +58,7 @@
         <w:rPr>
           <w:rFonts w:ascii="Arial" w:hAnsi="Arial" w:eastAsia="Arial" w:cs="Arial"/>
           <w:noProof w:val="0"/>
+          <w:color w:val="auto"/>
           <w:sz w:val="22"/>
           <w:szCs w:val="22"/>
           <w:lang w:val="es-ES"/>
@@ -64,6 +69,7 @@
         <w:rPr>
           <w:rFonts w:ascii="Arial" w:hAnsi="Arial" w:eastAsia="Arial" w:cs="Arial"/>
           <w:noProof w:val="0"/>
+          <w:color w:val="auto"/>
           <w:sz w:val="22"/>
           <w:szCs w:val="22"/>
           <w:lang w:val="es-ES"/>
@@ -80,6 +86,7 @@
           <w:b w:val="1"/>
           <w:bCs w:val="1"/>
           <w:noProof w:val="0"/>
+          <w:color w:val="auto"/>
           <w:sz w:val="22"/>
           <w:szCs w:val="22"/>
           <w:lang w:val="es-ES"/>
@@ -91,6 +98,7 @@
           <w:b w:val="1"/>
           <w:bCs w:val="1"/>
           <w:noProof w:val="0"/>
+          <w:color w:val="auto"/>
           <w:sz w:val="22"/>
           <w:szCs w:val="22"/>
           <w:lang w:val="es-ES"/>
@@ -104,15 +112,17 @@
         <w:rPr>
           <w:rFonts w:ascii="Arial" w:hAnsi="Arial" w:eastAsia="Arial" w:cs="Arial"/>
           <w:noProof w:val="0"/>
-          <w:sz w:val="22"/>
-          <w:szCs w:val="22"/>
-          <w:lang w:val="es-ES"/>
-        </w:rPr>
-      </w:pPr>
-      <w:r>
-        <w:rPr>
-          <w:rFonts w:ascii="Arial" w:hAnsi="Arial" w:eastAsia="Arial" w:cs="Arial"/>
-          <w:noProof w:val="0"/>
+          <w:color w:val="auto"/>
+          <w:sz w:val="22"/>
+          <w:szCs w:val="22"/>
+          <w:lang w:val="es-ES"/>
+        </w:rPr>
+      </w:pPr>
+      <w:r>
+        <w:rPr>
+          <w:rFonts w:ascii="Arial" w:hAnsi="Arial" w:eastAsia="Arial" w:cs="Arial"/>
+          <w:noProof w:val="0"/>
+          <w:color w:val="auto"/>
           <w:sz w:val="22"/>
           <w:szCs w:val="22"/>
           <w:lang w:val="es-ES"/>
@@ -130,7 +140,7 @@
       </w:pPr>
       <w:r>
         <w:drawing>
-          <wp:inline wp14:editId="38275C37" wp14:anchorId="647A3D84">
+          <wp:inline wp14:editId="64010AB3" wp14:anchorId="647A3D84">
             <wp:extent cx="5724525" cy="2600325"/>
             <wp:effectExtent l="0" t="0" r="0" b="0"/>
             <wp:docPr id="1781919824" name="drawing"/>
@@ -181,6 +191,7 @@
           <w:b w:val="1"/>
           <w:bCs w:val="1"/>
           <w:noProof w:val="0"/>
+          <w:color w:val="auto"/>
           <w:sz w:val="22"/>
           <w:szCs w:val="22"/>
           <w:lang w:val="es-ES"/>
@@ -192,6 +203,7 @@
           <w:b w:val="1"/>
           <w:bCs w:val="1"/>
           <w:noProof w:val="0"/>
+          <w:color w:val="auto"/>
           <w:sz w:val="22"/>
           <w:szCs w:val="22"/>
           <w:lang w:val="es-ES"/>
@@ -205,15 +217,17 @@
         <w:rPr>
           <w:rFonts w:ascii="Arial" w:hAnsi="Arial" w:eastAsia="Arial" w:cs="Arial"/>
           <w:noProof w:val="0"/>
-          <w:sz w:val="22"/>
-          <w:szCs w:val="22"/>
-          <w:lang w:val="es-ES"/>
-        </w:rPr>
-      </w:pPr>
-      <w:r>
-        <w:rPr>
-          <w:rFonts w:ascii="Arial" w:hAnsi="Arial" w:eastAsia="Arial" w:cs="Arial"/>
-          <w:noProof w:val="0"/>
+          <w:color w:val="auto"/>
+          <w:sz w:val="22"/>
+          <w:szCs w:val="22"/>
+          <w:lang w:val="es-ES"/>
+        </w:rPr>
+      </w:pPr>
+      <w:r>
+        <w:rPr>
+          <w:rFonts w:ascii="Arial" w:hAnsi="Arial" w:eastAsia="Arial" w:cs="Arial"/>
+          <w:noProof w:val="0"/>
+          <w:color w:val="auto"/>
           <w:sz w:val="22"/>
           <w:szCs w:val="22"/>
           <w:lang w:val="es-ES"/>
@@ -224,6 +238,7 @@
         <w:rPr>
           <w:rFonts w:ascii="Arial" w:hAnsi="Arial" w:eastAsia="Arial" w:cs="Arial"/>
           <w:noProof w:val="0"/>
+          <w:color w:val="auto"/>
           <w:sz w:val="22"/>
           <w:szCs w:val="22"/>
           <w:lang w:val="es-ES"/>
@@ -234,6 +249,7 @@
         <w:rPr>
           <w:rFonts w:ascii="Arial" w:hAnsi="Arial" w:eastAsia="Arial" w:cs="Arial"/>
           <w:noProof w:val="0"/>
+          <w:color w:val="auto"/>
           <w:sz w:val="22"/>
           <w:szCs w:val="22"/>
           <w:lang w:val="es-ES"/>
@@ -244,6 +260,7 @@
         <w:rPr>
           <w:rFonts w:ascii="Arial" w:hAnsi="Arial" w:eastAsia="Arial" w:cs="Arial"/>
           <w:noProof w:val="0"/>
+          <w:color w:val="auto"/>
           <w:sz w:val="22"/>
           <w:szCs w:val="22"/>
           <w:lang w:val="es-ES"/>
@@ -254,6 +271,7 @@
         <w:rPr>
           <w:rFonts w:ascii="Arial" w:hAnsi="Arial" w:eastAsia="Arial" w:cs="Arial"/>
           <w:noProof w:val="0"/>
+          <w:color w:val="auto"/>
           <w:sz w:val="22"/>
           <w:szCs w:val="22"/>
           <w:lang w:val="es-ES"/>
@@ -264,6 +282,7 @@
         <w:rPr>
           <w:rFonts w:ascii="Arial" w:hAnsi="Arial" w:eastAsia="Arial" w:cs="Arial"/>
           <w:noProof w:val="0"/>
+          <w:color w:val="auto"/>
           <w:sz w:val="22"/>
           <w:szCs w:val="22"/>
           <w:lang w:val="es-ES"/>
@@ -280,6 +299,7 @@
           <w:b w:val="1"/>
           <w:bCs w:val="1"/>
           <w:noProof w:val="0"/>
+          <w:color w:val="auto"/>
           <w:sz w:val="22"/>
           <w:szCs w:val="22"/>
           <w:lang w:val="es-ES"/>
@@ -291,6 +311,7 @@
           <w:b w:val="1"/>
           <w:bCs w:val="1"/>
           <w:noProof w:val="0"/>
+          <w:color w:val="auto"/>
           <w:sz w:val="22"/>
           <w:szCs w:val="22"/>
           <w:lang w:val="es-ES"/>
@@ -304,15 +325,17 @@
         <w:rPr>
           <w:rFonts w:ascii="Arial" w:hAnsi="Arial" w:eastAsia="Arial" w:cs="Arial"/>
           <w:noProof w:val="0"/>
-          <w:sz w:val="22"/>
-          <w:szCs w:val="22"/>
-          <w:lang w:val="es-ES"/>
-        </w:rPr>
-      </w:pPr>
-      <w:r>
-        <w:rPr>
-          <w:rFonts w:ascii="Arial" w:hAnsi="Arial" w:eastAsia="Arial" w:cs="Arial"/>
-          <w:noProof w:val="0"/>
+          <w:color w:val="auto"/>
+          <w:sz w:val="22"/>
+          <w:szCs w:val="22"/>
+          <w:lang w:val="es-ES"/>
+        </w:rPr>
+      </w:pPr>
+      <w:r>
+        <w:rPr>
+          <w:rFonts w:ascii="Arial" w:hAnsi="Arial" w:eastAsia="Arial" w:cs="Arial"/>
+          <w:noProof w:val="0"/>
+          <w:color w:val="auto"/>
           <w:sz w:val="22"/>
           <w:szCs w:val="22"/>
           <w:lang w:val="es-ES"/>
@@ -323,6 +346,7 @@
         <w:rPr>
           <w:rFonts w:ascii="Arial" w:hAnsi="Arial" w:eastAsia="Arial" w:cs="Arial"/>
           <w:noProof w:val="0"/>
+          <w:color w:val="auto"/>
           <w:sz w:val="22"/>
           <w:szCs w:val="22"/>
           <w:lang w:val="es-ES"/>
@@ -333,6 +357,7 @@
         <w:rPr>
           <w:rFonts w:ascii="Arial" w:hAnsi="Arial" w:eastAsia="Arial" w:cs="Arial"/>
           <w:noProof w:val="0"/>
+          <w:color w:val="auto"/>
           <w:sz w:val="22"/>
           <w:szCs w:val="22"/>
           <w:lang w:val="es-ES"/>
@@ -343,6 +368,7 @@
         <w:rPr>
           <w:rFonts w:ascii="Arial" w:hAnsi="Arial" w:eastAsia="Arial" w:cs="Arial"/>
           <w:noProof w:val="0"/>
+          <w:color w:val="auto"/>
           <w:sz w:val="22"/>
           <w:szCs w:val="22"/>
           <w:lang w:val="es-ES"/>
@@ -353,6 +379,7 @@
         <w:rPr>
           <w:rFonts w:ascii="Arial" w:hAnsi="Arial" w:eastAsia="Arial" w:cs="Arial"/>
           <w:noProof w:val="0"/>
+          <w:color w:val="auto"/>
           <w:sz w:val="22"/>
           <w:szCs w:val="22"/>
           <w:lang w:val="es-ES"/>
@@ -363,6 +390,7 @@
         <w:rPr>
           <w:rFonts w:ascii="Arial" w:hAnsi="Arial" w:eastAsia="Arial" w:cs="Arial"/>
           <w:noProof w:val="0"/>
+          <w:color w:val="auto"/>
           <w:sz w:val="22"/>
           <w:szCs w:val="22"/>
           <w:lang w:val="es-ES"/>
@@ -373,6 +401,7 @@
         <w:rPr>
           <w:rFonts w:ascii="Arial" w:hAnsi="Arial" w:eastAsia="Arial" w:cs="Arial"/>
           <w:noProof w:val="0"/>
+          <w:color w:val="auto"/>
           <w:sz w:val="22"/>
           <w:szCs w:val="22"/>
           <w:lang w:val="es-ES"/>
@@ -388,7 +417,10 @@
           <w:rFonts w:ascii="Arial" w:hAnsi="Arial" w:eastAsia="Arial" w:cs="Arial"/>
           <w:b w:val="1"/>
           <w:bCs w:val="1"/>
-          <w:noProof w:val="0"/>
+          <w:i w:val="0"/>
+          <w:iCs w:val="0"/>
+          <w:noProof w:val="0"/>
+          <w:color w:val="auto"/>
           <w:sz w:val="22"/>
           <w:szCs w:val="22"/>
           <w:lang w:val="es-ES"/>
@@ -399,7 +431,10 @@
           <w:rFonts w:ascii="Arial" w:hAnsi="Arial" w:eastAsia="Arial" w:cs="Arial"/>
           <w:b w:val="1"/>
           <w:bCs w:val="1"/>
-          <w:noProof w:val="0"/>
+          <w:i w:val="0"/>
+          <w:iCs w:val="0"/>
+          <w:noProof w:val="0"/>
+          <w:color w:val="auto"/>
           <w:sz w:val="22"/>
           <w:szCs w:val="22"/>
           <w:lang w:val="es-ES"/>
@@ -413,15 +448,17 @@
         <w:rPr>
           <w:rFonts w:ascii="Arial" w:hAnsi="Arial" w:eastAsia="Arial" w:cs="Arial"/>
           <w:noProof w:val="0"/>
-          <w:sz w:val="22"/>
-          <w:szCs w:val="22"/>
-          <w:lang w:val="es-ES"/>
-        </w:rPr>
-      </w:pPr>
-      <w:r>
-        <w:rPr>
-          <w:rFonts w:ascii="Arial" w:hAnsi="Arial" w:eastAsia="Arial" w:cs="Arial"/>
-          <w:noProof w:val="0"/>
+          <w:color w:val="auto"/>
+          <w:sz w:val="22"/>
+          <w:szCs w:val="22"/>
+          <w:lang w:val="es-ES"/>
+        </w:rPr>
+      </w:pPr>
+      <w:r>
+        <w:rPr>
+          <w:rFonts w:ascii="Arial" w:hAnsi="Arial" w:eastAsia="Arial" w:cs="Arial"/>
+          <w:noProof w:val="0"/>
+          <w:color w:val="auto"/>
           <w:sz w:val="22"/>
           <w:szCs w:val="22"/>
           <w:lang w:val="es-ES"/>
@@ -432,6 +469,7 @@
         <w:rPr>
           <w:rFonts w:ascii="Arial" w:hAnsi="Arial" w:eastAsia="Arial" w:cs="Arial"/>
           <w:noProof w:val="0"/>
+          <w:color w:val="auto"/>
           <w:sz w:val="22"/>
           <w:szCs w:val="22"/>
           <w:lang w:val="es-ES"/>
@@ -442,6 +480,7 @@
         <w:rPr>
           <w:rFonts w:ascii="Arial" w:hAnsi="Arial" w:eastAsia="Arial" w:cs="Arial"/>
           <w:noProof w:val="0"/>
+          <w:color w:val="auto"/>
           <w:sz w:val="22"/>
           <w:szCs w:val="22"/>
           <w:lang w:val="es-ES"/>
@@ -452,6 +491,7 @@
         <w:rPr>
           <w:rFonts w:ascii="Arial" w:hAnsi="Arial" w:eastAsia="Arial" w:cs="Arial"/>
           <w:noProof w:val="0"/>
+          <w:color w:val="auto"/>
           <w:sz w:val="22"/>
           <w:szCs w:val="22"/>
           <w:lang w:val="es-ES"/>
@@ -462,6 +502,7 @@
         <w:rPr>
           <w:rFonts w:ascii="Arial" w:hAnsi="Arial" w:eastAsia="Arial" w:cs="Arial"/>
           <w:noProof w:val="0"/>
+          <w:color w:val="auto"/>
           <w:sz w:val="22"/>
           <w:szCs w:val="22"/>
           <w:lang w:val="es-ES"/>
@@ -475,15 +516,17 @@
         <w:rPr>
           <w:rFonts w:ascii="Arial" w:hAnsi="Arial" w:eastAsia="Arial" w:cs="Arial"/>
           <w:noProof w:val="0"/>
-          <w:sz w:val="22"/>
-          <w:szCs w:val="22"/>
-          <w:lang w:val="es-ES"/>
-        </w:rPr>
-      </w:pPr>
-      <w:r>
-        <w:rPr>
-          <w:rFonts w:ascii="Arial" w:hAnsi="Arial" w:eastAsia="Arial" w:cs="Arial"/>
-          <w:noProof w:val="0"/>
+          <w:color w:val="auto"/>
+          <w:sz w:val="22"/>
+          <w:szCs w:val="22"/>
+          <w:lang w:val="es-ES"/>
+        </w:rPr>
+      </w:pPr>
+      <w:r>
+        <w:rPr>
+          <w:rFonts w:ascii="Arial" w:hAnsi="Arial" w:eastAsia="Arial" w:cs="Arial"/>
+          <w:noProof w:val="0"/>
+          <w:color w:val="auto"/>
           <w:sz w:val="22"/>
           <w:szCs w:val="22"/>
           <w:lang w:val="es-ES"/>
@@ -494,6 +537,7 @@
         <w:rPr>
           <w:rFonts w:ascii="Arial" w:hAnsi="Arial" w:eastAsia="Arial" w:cs="Arial"/>
           <w:noProof w:val="0"/>
+          <w:color w:val="auto"/>
           <w:sz w:val="22"/>
           <w:szCs w:val="22"/>
           <w:lang w:val="es-ES"/>
@@ -504,6 +548,7 @@
         <w:rPr>
           <w:rFonts w:ascii="Arial" w:hAnsi="Arial" w:eastAsia="Arial" w:cs="Arial"/>
           <w:noProof w:val="0"/>
+          <w:color w:val="auto"/>
           <w:sz w:val="22"/>
           <w:szCs w:val="22"/>
           <w:lang w:val="es-ES"/>
@@ -514,6 +559,7 @@
         <w:rPr>
           <w:rFonts w:ascii="Arial" w:hAnsi="Arial" w:eastAsia="Arial" w:cs="Arial"/>
           <w:noProof w:val="0"/>
+          <w:color w:val="auto"/>
           <w:sz w:val="22"/>
           <w:szCs w:val="22"/>
           <w:lang w:val="es-ES"/>
@@ -524,6 +570,7 @@
         <w:rPr>
           <w:rFonts w:ascii="Arial" w:hAnsi="Arial" w:eastAsia="Arial" w:cs="Arial"/>
           <w:noProof w:val="0"/>
+          <w:color w:val="auto"/>
           <w:sz w:val="22"/>
           <w:szCs w:val="22"/>
           <w:lang w:val="es-ES"/>
@@ -534,6 +581,7 @@
         <w:rPr>
           <w:rFonts w:ascii="Arial" w:hAnsi="Arial" w:eastAsia="Arial" w:cs="Arial"/>
           <w:noProof w:val="0"/>
+          <w:color w:val="auto"/>
           <w:sz w:val="22"/>
           <w:szCs w:val="22"/>
           <w:lang w:val="es-ES"/>
@@ -547,7 +595,7 @@
       </w:pPr>
       <w:r>
         <w:drawing>
-          <wp:inline wp14:editId="50D00F56" wp14:anchorId="2EB06C2D">
+          <wp:inline wp14:editId="1D838FB5" wp14:anchorId="2EB06C2D">
             <wp:extent cx="5724525" cy="2333625"/>
             <wp:effectExtent l="0" t="0" r="0" b="0"/>
             <wp:docPr id="121356830" name="drawing"/>
@@ -587,6 +635,380 @@
             </a:graphic>
           </wp:inline>
         </w:drawing>
+      </w:r>
+    </w:p>
+    <w:p>
+      <w:pPr>
+        <w:pStyle w:val="Normal"/>
+      </w:pPr>
+    </w:p>
+    <w:p>
+      <w:pPr>
+        <w:pStyle w:val="Normal"/>
+      </w:pPr>
+    </w:p>
+    <w:p>
+      <w:pPr>
+        <w:pStyle w:val="Normal"/>
+      </w:pPr>
+    </w:p>
+    <w:p>
+      <w:pPr>
+        <w:pStyle w:val="Normal"/>
+      </w:pPr>
+    </w:p>
+    <w:p>
+      <w:pPr>
+        <w:pStyle w:val="Normal"/>
+      </w:pPr>
+    </w:p>
+    <w:p>
+      <w:pPr>
+        <w:pStyle w:val="Normal"/>
+      </w:pPr>
+    </w:p>
+    <w:p>
+      <w:pPr>
+        <w:pStyle w:val="Normal"/>
+      </w:pPr>
+    </w:p>
+    <w:p>
+      <w:pPr>
+        <w:pStyle w:val="Normal"/>
+      </w:pPr>
+    </w:p>
+    <w:p>
+      <w:pPr>
+        <w:pStyle w:val="Normal"/>
+      </w:pPr>
+    </w:p>
+    <w:p>
+      <w:pPr>
+        <w:pStyle w:val="Normal"/>
+      </w:pPr>
+    </w:p>
+    <w:p>
+      <w:pPr>
+        <w:pStyle w:val="Normal"/>
+      </w:pPr>
+    </w:p>
+    <w:p>
+      <w:pPr>
+        <w:pStyle w:val="Normal"/>
+      </w:pPr>
+    </w:p>
+    <w:p>
+      <w:pPr>
+        <w:pStyle w:val="Normal"/>
+      </w:pPr>
+    </w:p>
+    <w:p>
+      <w:pPr>
+        <w:pStyle w:val="Heading3"/>
+        <w:spacing w:before="281" w:beforeAutospacing="off" w:after="281" w:afterAutospacing="off"/>
+        <w:rPr>
+          <w:rFonts w:ascii="Aptos" w:hAnsi="Aptos" w:eastAsia="Aptos" w:cs="Aptos"/>
+          <w:b w:val="1"/>
+          <w:bCs w:val="1"/>
+          <w:noProof w:val="0"/>
+          <w:color w:val="auto"/>
+          <w:sz w:val="28"/>
+          <w:szCs w:val="28"/>
+          <w:lang w:val="es-ES"/>
+        </w:rPr>
+      </w:pPr>
+      <w:r>
+        <w:rPr>
+          <w:rFonts w:ascii="Aptos" w:hAnsi="Aptos" w:eastAsia="Aptos" w:cs="Aptos"/>
+          <w:b w:val="1"/>
+          <w:bCs w:val="1"/>
+          <w:noProof w:val="0"/>
+          <w:color w:val="auto"/>
+          <w:sz w:val="28"/>
+          <w:szCs w:val="28"/>
+          <w:lang w:val="es-ES"/>
+        </w:rPr>
+        <w:t>Error de depuración N.º 2: Desbordamiento de pila por recursividad mal planteada</w:t>
+      </w:r>
+    </w:p>
+    <w:p>
+      <w:pPr>
+        <w:spacing w:before="240" w:beforeAutospacing="off" w:after="240" w:afterAutospacing="off"/>
+      </w:pPr>
+      <w:r>
+        <w:rPr>
+          <w:rFonts w:ascii="Aptos" w:hAnsi="Aptos" w:eastAsia="Aptos" w:cs="Aptos"/>
+          <w:b w:val="1"/>
+          <w:bCs w:val="1"/>
+          <w:noProof w:val="0"/>
+          <w:sz w:val="24"/>
+          <w:szCs w:val="24"/>
+          <w:lang w:val="es-ES"/>
+        </w:rPr>
+        <w:t>Descripción del error:</w:t>
+      </w:r>
+      <w:r>
+        <w:br/>
+      </w:r>
+      <w:r>
+        <w:rPr>
+          <w:rFonts w:ascii="Aptos" w:hAnsi="Aptos" w:eastAsia="Aptos" w:cs="Aptos"/>
+          <w:noProof w:val="0"/>
+          <w:sz w:val="24"/>
+          <w:szCs w:val="24"/>
+          <w:lang w:val="es-ES"/>
+        </w:rPr>
+        <w:t xml:space="preserve"> La primera versión de la función </w:t>
+      </w:r>
+      <w:r>
+        <w:rPr>
+          <w:rFonts w:ascii="Consolas" w:hAnsi="Consolas" w:eastAsia="Consolas" w:cs="Consolas"/>
+          <w:noProof w:val="0"/>
+          <w:sz w:val="24"/>
+          <w:szCs w:val="24"/>
+          <w:lang w:val="es-ES"/>
+        </w:rPr>
+        <w:t>auditoria</w:t>
+      </w:r>
+      <w:r>
+        <w:rPr>
+          <w:rFonts w:ascii="Aptos" w:hAnsi="Aptos" w:eastAsia="Aptos" w:cs="Aptos"/>
+          <w:noProof w:val="0"/>
+          <w:sz w:val="24"/>
+          <w:szCs w:val="24"/>
+          <w:lang w:val="es-ES"/>
+        </w:rPr>
+        <w:t xml:space="preserve"> generaba un error de </w:t>
+      </w:r>
+      <w:r>
+        <w:rPr>
+          <w:rFonts w:ascii="Aptos" w:hAnsi="Aptos" w:eastAsia="Aptos" w:cs="Aptos"/>
+          <w:i w:val="1"/>
+          <w:iCs w:val="1"/>
+          <w:noProof w:val="0"/>
+          <w:sz w:val="24"/>
+          <w:szCs w:val="24"/>
+          <w:lang w:val="es-ES"/>
+        </w:rPr>
+        <w:t>stack overflow</w:t>
+      </w:r>
+      <w:r>
+        <w:rPr>
+          <w:rFonts w:ascii="Aptos" w:hAnsi="Aptos" w:eastAsia="Aptos" w:cs="Aptos"/>
+          <w:noProof w:val="0"/>
+          <w:sz w:val="24"/>
+          <w:szCs w:val="24"/>
+          <w:lang w:val="es-ES"/>
+        </w:rPr>
+        <w:t xml:space="preserve"> (desbordamiento de pila). La función se ejecutaba recursivamente de forma continua para verificar cambios en el estado de la luz, sin ningún mecanismo de espera o control de frecuencia de ejecución.</w:t>
+      </w:r>
+    </w:p>
+    <w:p>
+      <w:pPr>
+        <w:spacing w:before="240" w:beforeAutospacing="off" w:after="240" w:afterAutospacing="off"/>
+      </w:pPr>
+      <w:r>
+        <w:rPr>
+          <w:rFonts w:ascii="Aptos" w:hAnsi="Aptos" w:eastAsia="Aptos" w:cs="Aptos"/>
+          <w:b w:val="1"/>
+          <w:bCs w:val="1"/>
+          <w:noProof w:val="0"/>
+          <w:sz w:val="24"/>
+          <w:szCs w:val="24"/>
+          <w:lang w:val="es-ES"/>
+        </w:rPr>
+        <w:t>Causa:</w:t>
+      </w:r>
+      <w:r>
+        <w:br/>
+      </w:r>
+      <w:r>
+        <w:rPr>
+          <w:rFonts w:ascii="Aptos" w:hAnsi="Aptos" w:eastAsia="Aptos" w:cs="Aptos"/>
+          <w:noProof w:val="0"/>
+          <w:sz w:val="24"/>
+          <w:szCs w:val="24"/>
+          <w:lang w:val="es-ES"/>
+        </w:rPr>
+        <w:t xml:space="preserve"> En la rama donde no se detectaba un cambio de color, la función volvía a llamarse a sí misma inmediatamente.</w:t>
+      </w:r>
+    </w:p>
+    <w:p>
+      <w:pPr>
+        <w:spacing w:before="240" w:beforeAutospacing="off" w:after="240" w:afterAutospacing="off"/>
+      </w:pPr>
+      <w:r>
+        <w:rPr>
+          <w:rFonts w:ascii="Aptos" w:hAnsi="Aptos" w:eastAsia="Aptos" w:cs="Aptos"/>
+          <w:noProof w:val="0"/>
+          <w:sz w:val="24"/>
+          <w:szCs w:val="24"/>
+          <w:lang w:val="es-ES"/>
+        </w:rPr>
+        <w:t>Esto provocaba una cantidad excesiva de llamadas recursivas en muy poco tiempo, acumulando marcos en la pila hasta alcanzar el límite de memoria disponible.</w:t>
+      </w:r>
+    </w:p>
+    <w:p>
+      <w:pPr>
+        <w:spacing w:before="240" w:beforeAutospacing="off" w:after="240" w:afterAutospacing="off"/>
+      </w:pPr>
+      <w:r>
+        <w:br/>
+      </w:r>
+      <w:r>
+        <w:rPr>
+          <w:rFonts w:ascii="Aptos" w:hAnsi="Aptos" w:eastAsia="Aptos" w:cs="Aptos"/>
+          <w:noProof w:val="0"/>
+          <w:sz w:val="24"/>
+          <w:szCs w:val="24"/>
+          <w:lang w:val="es-ES"/>
+        </w:rPr>
+        <w:t xml:space="preserve"> Durante la ejecución se obtuvo el siguiente mensaje de error:</w:t>
+      </w:r>
+    </w:p>
+    <w:p>
+      <w:pPr>
+        <w:pStyle w:val="Normal"/>
+      </w:pPr>
+      <w:r>
+        <w:drawing>
+          <wp:inline wp14:editId="054F5095" wp14:anchorId="4228A99A">
+            <wp:extent cx="5724525" cy="2686050"/>
+            <wp:effectExtent l="0" t="0" r="0" b="0"/>
+            <wp:docPr id="1236759821" name="drawing"/>
+            <wp:cNvGraphicFramePr>
+              <a:graphicFrameLocks noChangeAspect="1"/>
+            </wp:cNvGraphicFramePr>
+            <a:graphic>
+              <a:graphicData xmlns:a="http://schemas.openxmlformats.org/drawingml/2006/main" uri="http://schemas.openxmlformats.org/drawingml/2006/picture">
+                <pic:pic xmlns:pic="http://schemas.openxmlformats.org/drawingml/2006/picture">
+                  <pic:nvPicPr>
+                    <pic:cNvPr id="1236759821" name="Picture 1236759821"/>
+                    <pic:cNvPicPr/>
+                  </pic:nvPicPr>
+                  <pic:blipFill>
+                    <a:blip xmlns:r="http://schemas.openxmlformats.org/officeDocument/2006/relationships" r:embed="rId411136684">
+                      <a:extLst>
+                        <a:ext uri="{28A0092B-C50C-407E-A947-70E740481C1C}">
+                          <a14:useLocalDpi xmlns:a14="http://schemas.microsoft.com/office/drawing/2010/main"/>
+                        </a:ext>
+                      </a:extLst>
+                    </a:blip>
+                    <a:stretch>
+                      <a:fillRect/>
+                    </a:stretch>
+                  </pic:blipFill>
+                  <pic:spPr>
+                    <a:xfrm>
+                      <a:off x="0" y="0"/>
+                      <a:ext cx="5724525" cy="2686050"/>
+                    </a:xfrm>
+                    <a:prstGeom prst="rect">
+                      <a:avLst/>
+                    </a:prstGeom>
+                  </pic:spPr>
+                </pic:pic>
+              </a:graphicData>
+            </a:graphic>
+          </wp:inline>
+        </w:drawing>
+      </w:r>
+      <w:r>
+        <w:rPr>
+          <w:rFonts w:ascii="Aptos" w:hAnsi="Aptos" w:eastAsia="Aptos" w:cs="Aptos"/>
+          <w:b w:val="1"/>
+          <w:bCs w:val="1"/>
+          <w:noProof w:val="0"/>
+          <w:sz w:val="24"/>
+          <w:szCs w:val="24"/>
+          <w:lang w:val="es-ES"/>
+        </w:rPr>
+        <w:t>Solución implementada:</w:t>
+      </w:r>
+      <w:r>
+        <w:br/>
+      </w:r>
+      <w:r>
+        <w:rPr>
+          <w:rFonts w:ascii="Aptos" w:hAnsi="Aptos" w:eastAsia="Aptos" w:cs="Aptos"/>
+          <w:noProof w:val="0"/>
+          <w:sz w:val="24"/>
+          <w:szCs w:val="24"/>
+          <w:lang w:val="es-ES"/>
+        </w:rPr>
+        <w:t xml:space="preserve"> Se incorporó una función </w:t>
+      </w:r>
+      <w:r>
+        <w:rPr>
+          <w:rFonts w:ascii="Consolas" w:hAnsi="Consolas" w:eastAsia="Consolas" w:cs="Consolas"/>
+          <w:noProof w:val="0"/>
+          <w:sz w:val="24"/>
+          <w:szCs w:val="24"/>
+          <w:lang w:val="es-ES"/>
+        </w:rPr>
+        <w:t>sleep</w:t>
+      </w:r>
+      <w:r>
+        <w:rPr>
+          <w:rFonts w:ascii="Aptos" w:hAnsi="Aptos" w:eastAsia="Aptos" w:cs="Aptos"/>
+          <w:noProof w:val="0"/>
+          <w:sz w:val="24"/>
+          <w:szCs w:val="24"/>
+          <w:lang w:val="es-ES"/>
+        </w:rPr>
+        <w:t xml:space="preserve"> antes de realizar la nueva llamada recursiva, de manera que la auditoría se ejecute periódicamente y no de forma continua. Se estableció una pausa de </w:t>
+      </w:r>
+      <w:r>
+        <w:rPr>
+          <w:rFonts w:ascii="Aptos" w:hAnsi="Aptos" w:eastAsia="Aptos" w:cs="Aptos"/>
+          <w:b w:val="1"/>
+          <w:bCs w:val="1"/>
+          <w:noProof w:val="0"/>
+          <w:sz w:val="24"/>
+          <w:szCs w:val="24"/>
+          <w:lang w:val="es-ES"/>
+        </w:rPr>
+        <w:t>6 segundos</w:t>
+      </w:r>
+      <w:r>
+        <w:rPr>
+          <w:rFonts w:ascii="Aptos" w:hAnsi="Aptos" w:eastAsia="Aptos" w:cs="Aptos"/>
+          <w:noProof w:val="0"/>
+          <w:sz w:val="24"/>
+          <w:szCs w:val="24"/>
+          <w:lang w:val="es-ES"/>
+        </w:rPr>
+        <w:t>, ya que corresponde al tiempo mínimo observado para que el semáforo cambie de estado (por ejemplo, de amarillo a verde). Esto redujo significativamente la cantidad de llamadas recursivas y evitó el desbordamiento de la pila.</w:t>
+      </w:r>
+    </w:p>
+    <w:p>
+      <w:pPr>
+        <w:spacing w:before="240" w:beforeAutospacing="off" w:after="240" w:afterAutospacing="off"/>
+      </w:pPr>
+      <w:r>
+        <w:rPr>
+          <w:rFonts w:ascii="Aptos" w:hAnsi="Aptos" w:eastAsia="Aptos" w:cs="Aptos"/>
+          <w:b w:val="1"/>
+          <w:bCs w:val="1"/>
+          <w:noProof w:val="0"/>
+          <w:sz w:val="24"/>
+          <w:szCs w:val="24"/>
+          <w:lang w:val="es-ES"/>
+        </w:rPr>
+        <w:t>Resultado:</w:t>
+      </w:r>
+      <w:r>
+        <w:br/>
+      </w:r>
+      <w:r>
+        <w:rPr>
+          <w:rFonts w:ascii="Aptos" w:hAnsi="Aptos" w:eastAsia="Aptos" w:cs="Aptos"/>
+          <w:noProof w:val="0"/>
+          <w:sz w:val="24"/>
+          <w:szCs w:val="24"/>
+          <w:lang w:val="es-ES"/>
+        </w:rPr>
+        <w:t xml:space="preserve"> La función comenzó a monitorear correctamente los cambios de estado sin generar errores de memoria ni saturar la pila de ejecución.</w:t>
       </w:r>
     </w:p>
     <w:p>
@@ -1030,7 +1452,7 @@
     <w:name w:val="Hyperlink"/>
     <w:basedOn w:val="DefaultParagraphFont"/>
     <w:unhideWhenUsed/>
-    <w:rsid w:val="7CA9E373"/>
+    <w:rsid w:val="04E5088E"/>
     <w:rPr>
       <w:color w:val="467886"/>
       <w:u w:val="single"/>
@@ -1043,7 +1465,7 @@
     <w:next w:val="Normal"/>
     <w:unhideWhenUsed/>
     <w:qFormat/>
-    <w:rsid w:val="7CA9E373"/>
+    <w:rsid w:val="04E5088E"/>
     <w:rPr>
       <w:rFonts w:eastAsia="" w:cs="" w:eastAsiaTheme="majorEastAsia" w:cstheme="majorBidi"/>
       <w:color w:val="0F4761" w:themeColor="accent1" w:themeTint="FF" w:themeShade="BF"/>
@@ -1064,7 +1486,7 @@
     <w:next w:val="Normal"/>
     <w:unhideWhenUsed/>
     <w:qFormat/>
-    <w:rsid w:val="7CA9E373"/>
+    <w:rsid w:val="04E5088E"/>
     <w:rPr>
       <w:rFonts w:eastAsia="" w:cs="" w:eastAsiaTheme="majorEastAsia" w:cstheme="majorBidi"/>
       <w:i w:val="1"/>

</xml_diff>